<commit_message>
refactor: rename NILIMS to LIMS across site, content, seeds and docs
</commit_message>
<xml_diff>
--- a/docs/TIRDO-Website-User-Manual.docx
+++ b/docs/TIRDO-Website-User-Manual.docx
@@ -8685,7 +8685,7 @@
                 <w:sz w:val="19"/>
                 <w:szCs w:val="19"/>
               </w:rPr>
-              <w:t xml:space="preserve">Laboratory testing (NILIMS)</w:t>
+              <w:t xml:space="preserve">Laboratory testing (LIMS)</w:t>
             </w:r>
           </w:p>
         </w:tc>
@@ -9302,7 +9302,7 @@
                 <w:sz w:val="19"/>
                 <w:szCs w:val="19"/>
               </w:rPr>
-              <w:t xml:space="preserve">NILIMS / TeLTP / CIAP</w:t>
+              <w:t xml:space="preserve">LIMS / TeLTP / CIAP</w:t>
             </w:r>
           </w:p>
         </w:tc>

</xml_diff>